<commit_message>
Mark bevestigingsmail aftreden as verzonden 2 maart 2026
Adjusted date references in letter (heden/vandaag → 1 maart 2026) since
sending on 2 March instead of 1 March. Updated status across 6 files:
concept, positionering, dossier, dossiersynthese, bestandsoverzicht.
Regenerated docx.
</commit_message>
<xml_diff>
--- a/artifacts/Bevestiging_Aftreden_Bestuurder_1Maart2026.docx
+++ b/artifacts/Bevestiging_Aftreden_Bestuurder_1Maart2026.docx
@@ -66,7 +66,7 @@
           <w:sz w:val="22"/>
           <w:szCs w:val="22"/>
         </w:rPr>
-        <w:t xml:space="preserve">Oosterwolde, 1 maart 2026</w:t>
+        <w:t xml:space="preserve">Oosterwolde, 2 maart 2026</w:t>
       </w:r>
     </w:p>
     <w:p>
@@ -208,33 +208,33 @@
           <w:sz w:val="22"/>
           <w:szCs w:val="22"/>
         </w:rPr>
-        <w:t xml:space="preserve">Hierbij bevestig ik dat PHBX Holding B.V. per heden, 1 maart 2026, is afgetreden als bestuurder van Dinck B.V., conform mijn ontslagbrief d.d. 30 januari 2026.</w:t>
-      </w:r>
-    </w:p>
-    <w:p>
-      <w:pPr>
-        <w:spacing w:before="100" w:after="100"/>
-      </w:pPr>
-      <w:r>
-        <w:rPr>
-          <w:rFonts w:ascii="Arial" w:cs="Arial" w:eastAsia="Arial" w:hAnsi="Arial"/>
-          <w:sz w:val="22"/>
-          <w:szCs w:val="22"/>
-        </w:rPr>
-        <w:t xml:space="preserve"/>
-      </w:r>
-    </w:p>
-    <w:p>
-      <w:pPr>
-        <w:spacing w:before="100" w:after="100"/>
-      </w:pPr>
-      <w:r>
-        <w:rPr>
-          <w:rFonts w:ascii="Arial" w:cs="Arial" w:eastAsia="Arial" w:hAnsi="Arial"/>
-          <w:sz w:val="22"/>
-          <w:szCs w:val="22"/>
-        </w:rPr>
-        <w:t xml:space="preserve">De uitschrijving bij de Kamer van Koophandel is vandaag ingediend en digitaal ondertekend. Het wijzigingsformulier treft u bijgaand aan.</w:t>
+        <w:t xml:space="preserve">Hierbij bevestig ik dat PHBX Holding B.V. per 1 maart 2026 is afgetreden als bestuurder van Dinck B.V., conform mijn ontslagbrief d.d. 30 januari 2026.</w:t>
+      </w:r>
+    </w:p>
+    <w:p>
+      <w:pPr>
+        <w:spacing w:before="100" w:after="100"/>
+      </w:pPr>
+      <w:r>
+        <w:rPr>
+          <w:rFonts w:ascii="Arial" w:cs="Arial" w:eastAsia="Arial" w:hAnsi="Arial"/>
+          <w:sz w:val="22"/>
+          <w:szCs w:val="22"/>
+        </w:rPr>
+        <w:t xml:space="preserve"/>
+      </w:r>
+    </w:p>
+    <w:p>
+      <w:pPr>
+        <w:spacing w:before="100" w:after="100"/>
+      </w:pPr>
+      <w:r>
+        <w:rPr>
+          <w:rFonts w:ascii="Arial" w:cs="Arial" w:eastAsia="Arial" w:hAnsi="Arial"/>
+          <w:sz w:val="22"/>
+          <w:szCs w:val="22"/>
+        </w:rPr>
+        <w:t xml:space="preserve">De uitschrijving bij de Kamer van Koophandel is op 1 maart 2026 ingediend en digitaal ondertekend. Het wijzigingsformulier treft u bijgaand aan.</w:t>
       </w:r>
     </w:p>
     <w:p>

</xml_diff>